<commit_message>
Rework semester 5 lab grouping and scoring
</commit_message>
<xml_diff>
--- a/reports/C3_S5_LR02_Шаблон_отчёта.docx
+++ b/reports/C3_S5_LR02_Шаблон_отчёта.docx
@@ -827,7 +827,7 @@
                 <w:color w:val="000000"/>
                 <w:sz w:val="26"/>
               </w:rPr>
-              <w:t>Вопросы заказчику и протокол уточнения</w:t>
+              <w:t>Реестр требований по документам заказчика</w:t>
             </w:r>
           </w:p>
         </w:tc>
@@ -1970,7 +1970,7 @@
                 <w:color w:val="000000"/>
                 <w:sz w:val="18"/>
               </w:rPr>
-              <w:t>Вопросы заказчику и протокол уточнения</w:t>
+              <w:t>Реестр требований по документам заказчика</w:t>
             </w:r>
           </w:p>
         </w:tc>
@@ -2021,7 +2021,7 @@
                 <w:color w:val="000000"/>
                 <w:sz w:val="18"/>
               </w:rPr>
-              <w:t>Подготовить проверяемое уточнение неоднозначного брифинга.</w:t>
+              <w:t>Составить единый реестр требований по документам заказчика.</w:t>
             </w:r>
           </w:p>
         </w:tc>
@@ -2072,7 +2072,7 @@
                 <w:color w:val="000000"/>
                 <w:sz w:val="18"/>
               </w:rPr>
-              <w:t>Формулировать открытые, закрытые и уточняющие вопросы и фиксировать результат встречи.</w:t>
+              <w:t>Выделять функциональные и нефункциональные требования, ограничения и бизнес-правила, назначать им устойчивые идентификаторы и указывать точный источник.</w:t>
             </w:r>
           </w:p>
         </w:tc>
@@ -2123,7 +2123,7 @@
                 <w:color w:val="000000"/>
                 <w:sz w:val="18"/>
               </w:rPr>
-              <w:t>Набор вопросов и протокол уточнения</w:t>
+              <w:t>Реестр требований по документам заказчика</w:t>
             </w:r>
           </w:p>
         </w:tc>
@@ -2190,7 +2190,7 @@
     </w:p>
     <w:p>
       <w:r>
-        <w:t>В брифинге встречаются фразы «быстро», «без лишних полей» и «контроль обязателен», но нет измеримых условий и ответственных.</w:t>
+        <w:t>Заказчик передал брифинг, форму заявки, выгрузку остатков и пояснения сотрудников. В документах смешаны действия системы, показатели качества, внешние ограничения и правила работы склада.</w:t>
       </w:r>
     </w:p>
     <w:p>
@@ -2213,7 +2213,7 @@
           <w:color w:val="000000"/>
           <w:sz w:val="22"/>
         </w:rPr>
-        <w:t>Шесть неоднозначных фраз из брифинга.</w:t>
+        <w:t>Брифинг учебного распределительного центра.</w:t>
       </w:r>
     </w:p>
     <w:p>
@@ -2228,7 +2228,7 @@
           <w:color w:val="000000"/>
           <w:sz w:val="22"/>
         </w:rPr>
-        <w:t>Роли собеседников: начальник смены и специалист контроля.</w:t>
+        <w:t>Форма заявки клиента и фрагмент выгрузки остатков.</w:t>
       </w:r>
     </w:p>
     <w:p>
@@ -2243,7 +2243,7 @@
           <w:color w:val="000000"/>
           <w:sz w:val="22"/>
         </w:rPr>
-        <w:t>Шаблон протокола: вопрос, ответ, решение, открытый пункт.</w:t>
+        <w:t>Пояснения начальника смены и специалиста контроля.</w:t>
       </w:r>
     </w:p>
     <w:p>
@@ -2258,7 +2258,7 @@
           <w:color w:val="000000"/>
           <w:sz w:val="22"/>
         </w:rPr>
-        <w:t>Ограничение варианта: один из собеседников недоступен.</w:t>
+        <w:t>Конфликт между формой и устным пояснением из варианта студента.</w:t>
       </w:r>
     </w:p>
     <w:p>
@@ -2317,7 +2317,7 @@
         <w:pStyle w:val="2"/>
       </w:pPr>
       <w:r>
-        <w:t>Набор вопросов и протокол уточнения</w:t>
+        <w:t>Реестр требований по документам заказчика</w:t>
       </w:r>
     </w:p>
     <w:p>
@@ -2397,7 +2397,7 @@
                 <w:color w:val="000000"/>
                 <w:sz w:val="18"/>
               </w:rPr>
-              <w:t>Тип вопроса</w:t>
+              <w:t>Формулировка</w:t>
             </w:r>
           </w:p>
         </w:tc>
@@ -2425,7 +2425,7 @@
                 <w:color w:val="000000"/>
                 <w:sz w:val="18"/>
               </w:rPr>
-              <w:t>Адресат</w:t>
+              <w:t>Класс</w:t>
             </w:r>
           </w:p>
         </w:tc>
@@ -2453,7 +2453,7 @@
                 <w:color w:val="000000"/>
                 <w:sz w:val="18"/>
               </w:rPr>
-              <w:t>Вопрос</w:t>
+              <w:t>Источник</w:t>
             </w:r>
           </w:p>
         </w:tc>
@@ -2481,7 +2481,7 @@
                 <w:color w:val="000000"/>
                 <w:sz w:val="18"/>
               </w:rPr>
-              <w:t>Зачем задан</w:t>
+              <w:t>Фрагмент источника</w:t>
             </w:r>
           </w:p>
         </w:tc>
@@ -2509,7 +2509,7 @@
                 <w:color w:val="000000"/>
                 <w:sz w:val="18"/>
               </w:rPr>
-              <w:t>Статус ответа</w:t>
+              <w:t>Статус или вопрос</w:t>
             </w:r>
           </w:p>
         </w:tc>
@@ -3324,7 +3324,7 @@
           <w:color w:val="000000"/>
           <w:sz w:val="24"/>
         </w:rPr>
-        <w:t>Какие три вопроса блокируют проектирование и почему?</w:t>
+        <w:t>Какие записи нельзя считать подтверждёнными требованиями без уточнения и почему?</w:t>
       </w:r>
     </w:p>
     <w:tbl>
@@ -3994,7 +3994,7 @@
         <w:pStyle w:val="2"/>
       </w:pPr>
       <w:r>
-        <w:t>Критерии LMS · 10 баллов</w:t>
+        <w:t>Критерии LMS · 4 балла</w:t>
       </w:r>
     </w:p>
     <w:tbl>
@@ -4120,7 +4120,7 @@
                 <w:color w:val="000000"/>
                 <w:sz w:val="17"/>
               </w:rPr>
-              <w:t>4</w:t>
+              <w:t>1,6</w:t>
             </w:r>
           </w:p>
         </w:tc>
@@ -4174,7 +4174,7 @@
                 <w:color w:val="000000"/>
                 <w:sz w:val="17"/>
               </w:rPr>
-              <w:t>Не менее 10 вопросов трёх типов и протокол с решениями, допущениями и открытыми пунктами.</w:t>
+              <w:t>Реестр из 16–20 атомарных записей четырёх классов с уникальными ID, точными источниками и отметками неопределённости.</w:t>
             </w:r>
           </w:p>
         </w:tc>
@@ -4203,7 +4203,7 @@
                 <w:color w:val="000000"/>
                 <w:sz w:val="17"/>
               </w:rPr>
-              <w:t>2</w:t>
+              <w:t>0,8</w:t>
             </w:r>
           </w:p>
         </w:tc>
@@ -4286,7 +4286,7 @@
                 <w:color w:val="000000"/>
                 <w:sz w:val="17"/>
               </w:rPr>
-              <w:t>2</w:t>
+              <w:t>0,8</w:t>
             </w:r>
           </w:p>
         </w:tc>
@@ -4369,7 +4369,7 @@
                 <w:color w:val="000000"/>
                 <w:sz w:val="17"/>
               </w:rPr>
-              <w:t>1</w:t>
+              <w:t>0,4</w:t>
             </w:r>
           </w:p>
         </w:tc>
@@ -4423,7 +4423,7 @@
                 <w:color w:val="000000"/>
                 <w:sz w:val="17"/>
               </w:rPr>
-              <w:t>Каждый вопрос устраняет конкретную неопределённость и адресован роли, способной ответить.</w:t>
+              <w:t>Каждая запись содержит один проверяемый тезис, относится к обоснованному классу и ведёт к конкретному месту в документах заказчика.</w:t>
             </w:r>
           </w:p>
         </w:tc>
@@ -4452,7 +4452,7 @@
                 <w:color w:val="000000"/>
                 <w:sz w:val="17"/>
               </w:rPr>
-              <w:t>1</w:t>
+              <w:t>0,4</w:t>
             </w:r>
           </w:p>
         </w:tc>
@@ -4903,7 +4903,7 @@
             <w:color w:val="4056B5"/>
             <w:u w:val="single"/>
           </w:rPr>
-          <w:t>Лекция: Техника интервью</w:t>
+          <w:t>Лекция: Источники требований</w:t>
         </w:r>
       </w:hyperlink>
     </w:p>
@@ -4915,7 +4915,7 @@
             <w:color w:val="4056B5"/>
             <w:u w:val="single"/>
           </w:rPr>
-          <w:t>Лекция: Роли и точки зрения</w:t>
+          <w:t>Лекция: Классы требований</w:t>
         </w:r>
       </w:hyperlink>
     </w:p>
@@ -4927,12 +4927,24 @@
             <w:color w:val="4056B5"/>
             <w:u w:val="single"/>
           </w:rPr>
+          <w:t>Лекция: Допущения и трассируемость</w:t>
+        </w:r>
+      </w:hyperlink>
+    </w:p>
+    <w:p>
+      <w:hyperlink r:id="rId14">
+        <w:r>
+          <w:rPr>
+            <w:rFonts w:ascii="Times New Roman" w:hAnsi="Times New Roman"/>
+            <w:color w:val="4056B5"/>
+            <w:u w:val="single"/>
+          </w:rPr>
           <w:t>Материалы учебного кейса</w:t>
         </w:r>
       </w:hyperlink>
     </w:p>
     <w:p>
-      <w:hyperlink r:id="rId14">
+      <w:hyperlink r:id="rId15">
         <w:r>
           <w:rPr>
             <w:rFonts w:ascii="Times New Roman" w:hAnsi="Times New Roman"/>

</xml_diff>